<commit_message>
update airlock transfer request
</commit_message>
<xml_diff>
--- a/AirlockTransferRequest.docx
+++ b/AirlockTransferRequest.docx
@@ -837,72 +837,107 @@
         </w:rPr>
         <w:t>not on any contraceptive medication, subgroup analysis on females by time spent on combined pill.</w:t>
       </w:r>
-    </w:p>
-    <w:p>
-      <w:pPr>
-        <w:spacing w:after="0" w:line="240" w:lineRule="auto"/>
-        <w:rPr>
-          <w:rFonts w:ascii="Source Sans Pro" w:hAnsi="Source Sans Pro"/>
-          <w:color w:val="1B1B1B"/>
-          <w:sz w:val="29"/>
-          <w:szCs w:val="29"/>
-          <w:shd w:val="clear" w:color="auto" w:fill="FFFFFF"/>
-        </w:rPr>
-      </w:pPr>
-    </w:p>
-    <w:p>
-      <w:pPr>
-        <w:spacing w:after="0" w:line="240" w:lineRule="auto"/>
-        <w:rPr>
-          <w:rFonts w:ascii="Source Sans Pro" w:hAnsi="Source Sans Pro"/>
-          <w:color w:val="1B1B1B"/>
-          <w:sz w:val="29"/>
-          <w:szCs w:val="29"/>
-          <w:shd w:val="clear" w:color="auto" w:fill="FFFFFF"/>
-        </w:rPr>
-      </w:pPr>
-      <w:r>
-        <w:rPr>
-          <w:rFonts w:ascii="Source Sans Pro" w:hAnsi="Source Sans Pro"/>
-          <w:color w:val="1B1B1B"/>
-          <w:sz w:val="29"/>
-          <w:szCs w:val="29"/>
-          <w:shd w:val="clear" w:color="auto" w:fill="FFFFFF"/>
-        </w:rPr>
-        <w:t xml:space="preserve">SDC justification: Data outputted are results from logistic regression. Degrees of freedom are </w:t>
-      </w:r>
-      <w:r>
-        <w:rPr>
-          <w:rFonts w:ascii="Source Sans Pro" w:hAnsi="Source Sans Pro"/>
-          <w:color w:val="1B1B1B"/>
-          <w:sz w:val="29"/>
-          <w:szCs w:val="29"/>
-          <w:shd w:val="clear" w:color="auto" w:fill="FFFFFF"/>
-        </w:rPr>
-        <w:t xml:space="preserve">sufficiently </w:t>
-      </w:r>
-      <w:r>
-        <w:rPr>
-          <w:rFonts w:ascii="Source Sans Pro" w:hAnsi="Source Sans Pro"/>
-          <w:color w:val="1B1B1B"/>
-          <w:sz w:val="29"/>
-          <w:szCs w:val="29"/>
-          <w:shd w:val="clear" w:color="auto" w:fill="FFFFFF"/>
-        </w:rPr>
-        <w:t>large for all models (</w:t>
-      </w:r>
-      <w:r>
-        <w:rPr>
-          <w:rFonts w:ascii="Source Sans Pro" w:hAnsi="Source Sans Pro"/>
-          <w:color w:val="1B1B1B"/>
-          <w:sz w:val="29"/>
-          <w:szCs w:val="29"/>
-          <w:shd w:val="clear" w:color="auto" w:fill="FFFFFF"/>
-        </w:rPr>
-        <w:t>greater than 5 in OddsR</w:t>
+      <w:r>
+        <w:t xml:space="preserve"> </w:t>
+      </w:r>
+      <w:r>
+        <w:rPr>
+          <w:rFonts w:ascii="Source Sans Pro" w:hAnsi="Source Sans Pro"/>
+          <w:color w:val="1B1B1B"/>
+          <w:sz w:val="29"/>
+          <w:szCs w:val="29"/>
+          <w:shd w:val="clear" w:color="auto" w:fill="FFFFFF"/>
+        </w:rPr>
+        <w:t>This corresponds to an initial exploratory cross-sectional analysis relating to all 3 aims. Data outputted will be used for graphing and presenting to colleagues as well as at the OFH/</w:t>
+      </w:r>
+      <w:proofErr w:type="spellStart"/>
+      <w:r>
+        <w:rPr>
+          <w:rFonts w:ascii="Source Sans Pro" w:hAnsi="Source Sans Pro"/>
+          <w:color w:val="1B1B1B"/>
+          <w:sz w:val="29"/>
+          <w:szCs w:val="29"/>
+          <w:shd w:val="clear" w:color="auto" w:fill="FFFFFF"/>
+        </w:rPr>
+        <w:t>Asthma+LungUK</w:t>
+      </w:r>
+      <w:proofErr w:type="spellEnd"/>
+      <w:r>
+        <w:rPr>
+          <w:rFonts w:ascii="Source Sans Pro" w:hAnsi="Source Sans Pro"/>
+          <w:color w:val="1B1B1B"/>
+          <w:sz w:val="29"/>
+          <w:szCs w:val="29"/>
+          <w:shd w:val="clear" w:color="auto" w:fill="FFFFFF"/>
+        </w:rPr>
+        <w:t xml:space="preserve"> showcase.</w:t>
       </w:r>
       <w:bookmarkStart w:id="0" w:name="_GoBack"/>
       <w:bookmarkEnd w:id="0"/>
+    </w:p>
+    <w:p>
+      <w:pPr>
+        <w:spacing w:after="0" w:line="240" w:lineRule="auto"/>
+        <w:rPr>
+          <w:rFonts w:ascii="Source Sans Pro" w:hAnsi="Source Sans Pro"/>
+          <w:color w:val="1B1B1B"/>
+          <w:sz w:val="29"/>
+          <w:szCs w:val="29"/>
+          <w:shd w:val="clear" w:color="auto" w:fill="FFFFFF"/>
+        </w:rPr>
+      </w:pPr>
+    </w:p>
+    <w:p>
+      <w:pPr>
+        <w:spacing w:after="0" w:line="240" w:lineRule="auto"/>
+        <w:rPr>
+          <w:rFonts w:ascii="Source Sans Pro" w:hAnsi="Source Sans Pro"/>
+          <w:color w:val="1B1B1B"/>
+          <w:sz w:val="29"/>
+          <w:szCs w:val="29"/>
+          <w:shd w:val="clear" w:color="auto" w:fill="FFFFFF"/>
+        </w:rPr>
+      </w:pPr>
+      <w:r>
+        <w:rPr>
+          <w:rFonts w:ascii="Source Sans Pro" w:hAnsi="Source Sans Pro"/>
+          <w:color w:val="1B1B1B"/>
+          <w:sz w:val="29"/>
+          <w:szCs w:val="29"/>
+          <w:shd w:val="clear" w:color="auto" w:fill="FFFFFF"/>
+        </w:rPr>
+        <w:t xml:space="preserve">SDC justification: Data outputted are results from logistic regression. Degrees of freedom are </w:t>
+      </w:r>
+      <w:r>
+        <w:rPr>
+          <w:rFonts w:ascii="Source Sans Pro" w:hAnsi="Source Sans Pro"/>
+          <w:color w:val="1B1B1B"/>
+          <w:sz w:val="29"/>
+          <w:szCs w:val="29"/>
+          <w:shd w:val="clear" w:color="auto" w:fill="FFFFFF"/>
+        </w:rPr>
+        <w:t xml:space="preserve">sufficiently </w:t>
+      </w:r>
+      <w:r>
+        <w:rPr>
+          <w:rFonts w:ascii="Source Sans Pro" w:hAnsi="Source Sans Pro"/>
+          <w:color w:val="1B1B1B"/>
+          <w:sz w:val="29"/>
+          <w:szCs w:val="29"/>
+          <w:shd w:val="clear" w:color="auto" w:fill="FFFFFF"/>
+        </w:rPr>
+        <w:t>large for all models (</w:t>
+      </w:r>
+      <w:r>
+        <w:rPr>
+          <w:rFonts w:ascii="Source Sans Pro" w:hAnsi="Source Sans Pro"/>
+          <w:color w:val="1B1B1B"/>
+          <w:sz w:val="29"/>
+          <w:szCs w:val="29"/>
+          <w:shd w:val="clear" w:color="auto" w:fill="FFFFFF"/>
+        </w:rPr>
+        <w:t>greater than 5 in OddsR</w:t>
+      </w:r>
       <w:r>
         <w:rPr>
           <w:rFonts w:ascii="Source Sans Pro" w:hAnsi="Source Sans Pro"/>

</xml_diff>